<commit_message>
updates and additions to resume file and component structure
</commit_message>
<xml_diff>
--- a/public/ITHIEL-BALOGUN-RESUME 2026.docx
+++ b/public/ITHIEL-BALOGUN-RESUME 2026.docx
@@ -1251,19 +1251,7 @@
           <w:rPr>
             <w:rStyle w:val="Hyperlink"/>
           </w:rPr>
-          <w:t>ithielb9@gma</w:t>
-        </w:r>
-        <w:r>
-          <w:rPr>
-            <w:rStyle w:val="Hyperlink"/>
-          </w:rPr>
-          <w:t>i</w:t>
-        </w:r>
-        <w:r>
-          <w:rPr>
-            <w:rStyle w:val="Hyperlink"/>
-          </w:rPr>
-          <w:t>l.com</w:t>
+          <w:t>ithielb9@gmail.com</w:t>
         </w:r>
       </w:hyperlink>
       <w:r>
@@ -1436,20 +1424,11 @@
         </mc:AlternateContent>
       </w:r>
       <w:r>
-        <w:t xml:space="preserve"> 09168728729</w:t>
-      </w:r>
-      <w:r>
-        <w:t>.</w:t>
+        <w:t xml:space="preserve"> 09168728729.</w:t>
       </w:r>
       <w:r>
         <w:tab/>
-        <w:t xml:space="preserve">  </w:t>
-      </w:r>
-      <w:r>
-        <w:t>Lagos, Nigeria</w:t>
-      </w:r>
-      <w:r>
-        <w:t xml:space="preserve">  </w:t>
+        <w:t xml:space="preserve">  Lagos, Nigeria  </w:t>
       </w:r>
       <w:r>
         <w:rPr>
@@ -1683,13 +1662,7 @@
       </w:r>
       <w:hyperlink r:id="rId5">
         <w:r>
-          <w:t>https://gith</w:t>
-        </w:r>
-        <w:r>
-          <w:t>u</w:t>
-        </w:r>
-        <w:r>
-          <w:t>b.com/Cyberrpanda</w:t>
+          <w:t>https://github.com/Cyberrpanda</w:t>
         </w:r>
       </w:hyperlink>
       <w:hyperlink r:id="rId6">
@@ -1703,13 +1676,13 @@
       </w:hyperlink>
       <w:hyperlink r:id="rId7">
         <w:r>
-          <w:t>https://www.linkedi</w:t>
+          <w:t>https://www.linkedin.com/in/ithielbalog</w:t>
+        </w:r>
+        <w:r>
+          <w:t>u</w:t>
         </w:r>
         <w:r>
           <w:t>n</w:t>
-        </w:r>
-        <w:r>
-          <w:t>.com/in/ithielbalogun</w:t>
         </w:r>
       </w:hyperlink>
       <w:r>
@@ -1740,15 +1713,29 @@
       <w:r>
         <w:t xml:space="preserve"> </w:t>
       </w:r>
-      <w:hyperlink r:id="rId9">
-        <w:r>
-          <w:rPr>
-            <w:sz w:val="2"/>
-            <w:vertAlign w:val="superscript"/>
-          </w:rPr>
-          <w:t xml:space="preserve"> </w:t>
-        </w:r>
-      </w:hyperlink>
+      <w:r>
+        <w:fldChar w:fldCharType="begin"/>
+      </w:r>
+      <w:r>
+        <w:instrText>HYPERLINK "https://ithiels-portfolio.onrender.com/" \h</w:instrText>
+      </w:r>
+      <w:r>
+        <w:fldChar w:fldCharType="separate"/>
+      </w:r>
+      <w:r>
+        <w:rPr>
+          <w:sz w:val="2"/>
+          <w:vertAlign w:val="superscript"/>
+        </w:rPr>
+        <w:t xml:space="preserve"> </w:t>
+      </w:r>
+      <w:r>
+        <w:rPr>
+          <w:sz w:val="2"/>
+          <w:vertAlign w:val="superscript"/>
+        </w:rPr>
+        <w:fldChar w:fldCharType="end"/>
+      </w:r>
       <w:r>
         <w:rPr>
           <w:noProof/>
@@ -2893,6 +2880,9 @@
       <w:r>
         <w:t>Inventory Lifecycle Management</w:t>
       </w:r>
+      <w:r>
+        <w:t>.</w:t>
+      </w:r>
     </w:p>
     <w:p>
       <w:pPr>
@@ -3027,7 +3017,10 @@
         <w:tab/>
       </w:r>
       <w:r>
-        <w:t>06/2025 – Present</w:t>
+        <w:t xml:space="preserve">JUN </w:t>
+      </w:r>
+      <w:r>
+        <w:t>2025 – Present</w:t>
       </w:r>
     </w:p>
     <w:p>
@@ -3044,11 +3037,19 @@
         <w:rPr>
           <w:i/>
         </w:rPr>
-        <w:tab/>
+        <w:t xml:space="preserve"> </w:t>
       </w:r>
       <w:r>
         <w:t xml:space="preserve">24/25 Marina Rd, </w:t>
       </w:r>
+      <w:r>
+        <w:t>Lagos Island, Nigeria</w:t>
+      </w:r>
+    </w:p>
+    <w:p>
+      <w:pPr>
+        <w:ind w:left="21"/>
+      </w:pPr>
       <w:r>
         <w:rPr>
           <w:noProof/>
@@ -3230,9 +3231,6 @@
         </w:rPr>
         <w:tab/>
       </w:r>
-      <w:r>
-        <w:t xml:space="preserve"> Lagos Island, Nigeria</w:t>
-      </w:r>
     </w:p>
     <w:p>
       <w:pPr>
@@ -3247,7 +3245,13 @@
       </w:r>
       <w:proofErr w:type="spellEnd"/>
       <w:r>
-        <w:t xml:space="preserve">), improving document processing reliability and reducing scan-related support tickets. </w:t>
+        <w:t>), improving document processing reliability and reducing scan-related</w:t>
+      </w:r>
+      <w:r>
+        <w:t xml:space="preserve"> </w:t>
+      </w:r>
+      <w:r>
+        <w:t xml:space="preserve">support tickets. </w:t>
       </w:r>
     </w:p>
     <w:p>
@@ -3994,7 +3998,13 @@
         <w:tab/>
       </w:r>
       <w:r>
-        <w:t xml:space="preserve"> domain access, and deploying required applications, ensuring new users were operational on day one. </w:t>
+        <w:t xml:space="preserve"> </w:t>
+      </w:r>
+      <w:r>
+        <w:t xml:space="preserve">  </w:t>
+      </w:r>
+      <w:r>
+        <w:t xml:space="preserve">domain access, and deploying required applications, ensuring new users were operational on day one. </w:t>
       </w:r>
     </w:p>
     <w:p>
@@ -4742,8 +4752,28 @@
         <w:tab/>
       </w:r>
       <w:r>
-        <w:t xml:space="preserve">09/2023 – 10/2023 </w:t>
-      </w:r>
+        <w:rPr>
+          <w:b/>
+        </w:rPr>
+        <w:t xml:space="preserve">                                                                                                                  </w:t>
+      </w:r>
+      <w:r>
+        <w:t xml:space="preserve">SEP </w:t>
+      </w:r>
+      <w:r>
+        <w:t xml:space="preserve">2023 – </w:t>
+      </w:r>
+      <w:r>
+        <w:t xml:space="preserve">OCT </w:t>
+      </w:r>
+      <w:r>
+        <w:t xml:space="preserve">2023 </w:t>
+      </w:r>
+    </w:p>
+    <w:p>
+      <w:pPr>
+        <w:ind w:left="21"/>
+      </w:pPr>
       <w:proofErr w:type="spellStart"/>
       <w:r>
         <w:rPr>
@@ -4762,7 +4792,7 @@
         <w:rPr>
           <w:i/>
         </w:rPr>
-        <w:tab/>
+        <w:t xml:space="preserve"> </w:t>
       </w:r>
       <w:r>
         <w:t>Lagos, Nigeria.</w:t>
@@ -5332,7 +5362,16 @@
         <w:tab/>
       </w:r>
       <w:r>
-        <w:t>01/2023 – 06/2023</w:t>
+        <w:t xml:space="preserve">JAN </w:t>
+      </w:r>
+      <w:r>
+        <w:t xml:space="preserve">2023 – </w:t>
+      </w:r>
+      <w:r>
+        <w:t xml:space="preserve">JUN </w:t>
+      </w:r>
+      <w:r>
+        <w:t>2023</w:t>
       </w:r>
     </w:p>
     <w:p>
@@ -5649,7 +5688,7 @@
         <w:rPr>
           <w:i/>
         </w:rPr>
-        <w:tab/>
+        <w:t xml:space="preserve"> </w:t>
       </w:r>
       <w:r>
         <w:t xml:space="preserve">Awolowo </w:t>
@@ -5660,7 +5699,20 @@
       </w:r>
       <w:proofErr w:type="gramEnd"/>
       <w:r>
-        <w:t xml:space="preserve"> Ikeja , Completed a six-month frontend development internship, gaining hands-on</w:t>
+        <w:t xml:space="preserve"> Ikeja , </w:t>
+      </w:r>
+      <w:r>
+        <w:t>Lagos , Nigeria.</w:t>
+      </w:r>
+    </w:p>
+    <w:p>
+      <w:pPr>
+        <w:spacing w:after="0"/>
+        <w:ind w:left="212" w:right="-2" w:hanging="199"/>
+        <w:jc w:val="both"/>
+      </w:pPr>
+      <w:r>
+        <w:t>Completed a six-month frontend development internship, gaining hands-on</w:t>
       </w:r>
       <w:r>
         <w:rPr>
@@ -5674,10 +5726,10 @@
           <w:color w:val="FFFFFF"/>
           <w:sz w:val="2"/>
         </w:rPr>
-        <w:tab/>
-      </w:r>
-      <w:r>
-        <w:t xml:space="preserve"> Lagos , Nigeria. experience building production-style web applications. </w:t>
+        <w:t xml:space="preserve">       </w:t>
+      </w:r>
+      <w:r>
+        <w:t xml:space="preserve">experience building production-style web applications. </w:t>
       </w:r>
     </w:p>
     <w:p>
@@ -6173,13 +6225,6 @@
         <w:t>•</w:t>
       </w:r>
       <w:r>
-        <w:rPr>
-          <w:color w:val="FFFFFF"/>
-          <w:sz w:val="2"/>
-        </w:rPr>
-        <w:tab/>
-      </w:r>
-      <w:r>
         <w:t xml:space="preserve">: To engineer a comprehensive library web application featuring </w:t>
       </w:r>
       <w:r>
@@ -6638,13 +6683,6 @@
         <w:t>•</w:t>
       </w:r>
       <w:r>
-        <w:rPr>
-          <w:color w:val="FFFFFF"/>
-          <w:sz w:val="2"/>
-        </w:rPr>
-        <w:tab/>
-      </w:r>
-      <w:r>
         <w:t xml:space="preserve">: To develop a high-performance, feature-rich fleet rental platform. The primary goal was to leverage </w:t>
       </w:r>
       <w:r>
@@ -7115,13 +7153,6 @@
           <w:sz w:val="2"/>
         </w:rPr>
         <w:t>•</w:t>
-      </w:r>
-      <w:r>
-        <w:rPr>
-          <w:color w:val="FFFFFF"/>
-          <w:sz w:val="2"/>
-        </w:rPr>
-        <w:tab/>
       </w:r>
       <w:r>
         <w:t xml:space="preserve">: To build a fully functional, user-friendly medical platform designed to </w:t>
@@ -7564,13 +7595,6 @@
         <w:t>•</w:t>
       </w:r>
       <w:r>
-        <w:rPr>
-          <w:color w:val="FFFFFF"/>
-          <w:sz w:val="2"/>
-        </w:rPr>
-        <w:tab/>
-      </w:r>
-      <w:r>
         <w:t xml:space="preserve">: To create a </w:t>
       </w:r>
       <w:r>
@@ -8037,6 +8061,13 @@
       <w:r>
         <w:t xml:space="preserve"> To develop a fully responsive corporate website that showcases core services and improves online visibility and user accessibility. The project focused on delivering a smooth, intuitive browsing experience by refining UI/ UX design and user flows through direct client collaboration. A key priority was ensuring a mobile-friendly layout integrated with interactive elements like sliders to highlight specific services. </w:t>
       </w:r>
+    </w:p>
+    <w:p>
+      <w:pPr>
+        <w:spacing w:after="270"/>
+        <w:ind w:left="13" w:right="-2" w:firstLine="161"/>
+        <w:jc w:val="both"/>
+      </w:pPr>
       <w:r>
         <w:rPr>
           <w:noProof/>
@@ -8283,6 +8314,7 @@
         <w:ind w:left="-5"/>
       </w:pPr>
       <w:r>
+        <w:lastRenderedPageBreak/>
         <w:t>EDUCATION</w:t>
       </w:r>
     </w:p>
@@ -8397,7 +8429,6 @@
         <w:rPr>
           <w:b/>
         </w:rPr>
-        <w:lastRenderedPageBreak/>
         <w:t>Bachelor of Science</w:t>
       </w:r>
       <w:r>

</xml_diff>